<commit_message>
Embed rendered circuit diagram in the Word report
- Render the real water_tank.circ to docs/circuit_diagram.png using
  Logisim's painting API (verification/CircuitRenderer.java).
- Embed the diagram in docs/REPORT.md / REPORT.docx section 1.1 so the
  Word report visually contains the circuit (item 1) alongside the
  written items 2-6.

Co-Authored-By: Claude Fable 5 <noreply@anthropic.com>
Claude-Session: https://claude.ai/code/session_01LotSVQAVQAhQ3MvgpTCkTB
</commit_message>
<xml_diff>
--- a/water-tank-system/docs/REPORT.docx
+++ b/water-tank-system/docs/REPORT.docx
@@ -1819,6 +1819,108 @@
           <w:rFonts w:ascii="Calibri" w:cs="Calibri" w:eastAsia="Calibri" w:hAnsi="Calibri"/>
         </w:rPr>
         <w:t xml:space="preserve">CLOCK drives the register and counter flip-flops; RESET asynchronously clears all four flip-flops.</w:t>
+      </w:r>
+    </w:p>
+    <w:p>
+      <w:pPr>
+        <w:pStyle w:val="Heading2"/>
+        <w:spacing w:after="120" w:before="200"/>
+      </w:pPr>
+      <w:r>
+        <w:rPr>
+          <w:rFonts w:ascii="Calibri" w:cs="Calibri" w:eastAsia="Calibri" w:hAnsi="Calibri"/>
+          <w:b/>
+          <w:bCs/>
+        </w:rPr>
+        <w:t xml:space="preserve">1.1 The implemented circuit</w:t>
+      </w:r>
+    </w:p>
+    <w:p>
+      <w:pPr>
+        <w:spacing w:after="120"/>
+      </w:pPr>
+      <w:r>
+        <w:rPr>
+          <w:rFonts w:ascii="Calibri" w:cs="Calibri" w:eastAsia="Calibri" w:hAnsi="Calibri"/>
+        </w:rPr>
+        <w:t xml:space="preserve">The screenshot below is the actual </w:t>
+      </w:r>
+      <w:r>
+        <w:rPr>
+          <w:rFonts w:ascii="Consolas" w:cs="Consolas" w:eastAsia="Consolas" w:hAnsi="Consolas"/>
+          <w:sz w:val="20"/>
+          <w:szCs w:val="20"/>
+        </w:rPr>
+        <w:t xml:space="preserve">water_tank.circ</w:t>
+      </w:r>
+      <w:r>
+        <w:rPr>
+          <w:rFonts w:ascii="Calibri" w:cs="Calibri" w:eastAsia="Calibri" w:hAnsi="Calibri"/>
+        </w:rPr>
+        <w:t xml:space="preserve"> as built in Logisim. Each of the six stages is labelled on the canvas, matching the steps described in Sections 2–7. Inputs (S0–S3, RESET, CLOCK) are on the left; nets are carried between stages by named tunnels; outputs drive status LEDs and the 7-segment display.</w:t>
+      </w:r>
+    </w:p>
+    <w:p>
+      <w:pPr>
+        <w:spacing w:after="60" w:before="120"/>
+        <w:jc w:val="center"/>
+      </w:pPr>
+      <w:r>
+        <w:drawing>
+          <wp:inline distT="0" distB="0" distL="0" distR="0">
+            <wp:extent cx="5905500" cy="4667250"/>
+            <wp:effectExtent t="0" r="0" b="0" l="0"/>
+            <wp:docPr id="1" name="" descr="" title=""/>
+            <wp:cNvGraphicFramePr>
+              <a:graphicFrameLocks xmlns:a="http://schemas.openxmlformats.org/drawingml/2006/main" noChangeAspect="1"/>
+            </wp:cNvGraphicFramePr>
+            <a:graphic xmlns:a="http://schemas.openxmlformats.org/drawingml/2006/main">
+              <a:graphicData uri="http://schemas.openxmlformats.org/drawingml/2006/picture">
+                <pic:pic xmlns:pic="http://schemas.openxmlformats.org/drawingml/2006/picture">
+                  <pic:nvPicPr>
+                    <pic:cNvPr id="0" name="" descr=""/>
+                    <pic:cNvPicPr>
+                      <a:picLocks noChangeAspect="1" noChangeArrowheads="1"/>
+                    </pic:cNvPicPr>
+                  </pic:nvPicPr>
+                  <pic:blipFill>
+                    <a:blip r:embed="rId7" cstate="none"/>
+                    <a:srcRect/>
+                    <a:stretch>
+                      <a:fillRect/>
+                    </a:stretch>
+                  </pic:blipFill>
+                  <pic:spPr bwMode="auto">
+                    <a:xfrm>
+                      <a:off x="0" y="0"/>
+                      <a:ext cx="5905500" cy="4667250"/>
+                    </a:xfrm>
+                    <a:prstGeom prst="rect">
+                      <a:avLst/>
+                    </a:prstGeom>
+                  </pic:spPr>
+                </pic:pic>
+              </a:graphicData>
+            </a:graphic>
+          </wp:inline>
+        </w:drawing>
+      </w:r>
+    </w:p>
+    <w:p>
+      <w:pPr>
+        <w:spacing w:after="160"/>
+        <w:jc w:val="center"/>
+      </w:pPr>
+      <w:r>
+        <w:rPr>
+          <w:rFonts w:ascii="Calibri" w:cs="Calibri" w:eastAsia="Calibri" w:hAnsi="Calibri"/>
+          <w:i/>
+          <w:iCs/>
+          <w:color w:val="555555"/>
+          <w:sz w:val="18"/>
+          <w:szCs w:val="18"/>
+        </w:rPr>
+        <w:t xml:space="preserve">Full Logisim circuit — water_tank.circ, all six stages labelled</w:t>
       </w:r>
     </w:p>
     <w:p>

</xml_diff>